<commit_message>
Update SAPO Project documentation with user edits
</commit_message>
<xml_diff>
--- a/SAPO Project.docx
+++ b/SAPO Project.docx
@@ -82,13 +82,7 @@
         <w:rPr>
           <w:color w:val="60CAF3" w:themeColor="accent4" w:themeTint="99"/>
         </w:rPr>
-        <w:t>1</w:t>
-      </w:r>
-      <w:r>
-        <w:rPr>
-          <w:color w:val="60CAF3" w:themeColor="accent4" w:themeTint="99"/>
-        </w:rPr>
-        <w:t>. Introduction</w:t>
+        <w:t>1. Introduction</w:t>
       </w:r>
       <w:r>
         <w:rPr>
@@ -282,44 +276,24 @@
         </w:rPr>
         <w:t xml:space="preserve"> </w:t>
       </w:r>
+      <w:r>
+        <w:rPr>
+          <w:rFonts w:ascii="Times New Roman" w:eastAsia="Times New Roman" w:hAnsi="Times New Roman" w:cs="Times New Roman"/>
+          <w:color w:val="2E74B5"/>
+          <w:szCs w:val="22"/>
+        </w:rPr>
+        <w:t> </w:t>
+      </w:r>
       <w:hyperlink r:id="rId8" w:history="1">
         <w:r>
           <w:rPr>
             <w:rStyle w:val="Hyperlink"/>
             <w:rFonts w:ascii="Times New Roman" w:eastAsia="Times New Roman" w:hAnsi="Times New Roman" w:cs="Times New Roman"/>
-            <w:b/>
-            <w:color w:val="747474" w:themeColor="background2" w:themeShade="80"/>
             <w:szCs w:val="22"/>
           </w:rPr>
-          <w:t>https://github.com/Sowmya_2602/House</w:t>
+          <w:t>https://github.com/rakesh429/househunt-mern-stack</w:t>
         </w:r>
       </w:hyperlink>
-      <w:r>
-        <w:rPr>
-          <w:rFonts w:ascii="Times New Roman" w:eastAsia="Times New Roman" w:hAnsi="Times New Roman" w:cs="Times New Roman"/>
-          <w:b/>
-          <w:color w:val="747474" w:themeColor="background2" w:themeShade="80"/>
-          <w:szCs w:val="22"/>
-        </w:rPr>
-        <w:t xml:space="preserve">Hub </w:t>
-      </w:r>
-      <w:r>
-        <w:rPr>
-          <w:rFonts w:ascii="Times New Roman" w:eastAsia="Times New Roman" w:hAnsi="Times New Roman" w:cs="Times New Roman"/>
-          <w:b/>
-          <w:color w:val="747474" w:themeColor="background2" w:themeShade="80"/>
-          <w:szCs w:val="22"/>
-        </w:rPr>
-        <w:t xml:space="preserve"> </w:t>
-      </w:r>
-      <w:r>
-        <w:rPr>
-          <w:rFonts w:ascii="Times New Roman" w:eastAsia="Times New Roman" w:hAnsi="Times New Roman" w:cs="Times New Roman"/>
-          <w:color w:val="747474" w:themeColor="background2" w:themeShade="80"/>
-          <w:szCs w:val="22"/>
-        </w:rPr>
-        <w:t xml:space="preserve"> </w:t>
-      </w:r>
     </w:p>
     <w:p>
       <w:pPr>
@@ -356,7 +330,6 @@
         <w:tblCellMar>
           <w:top w:w="128" w:type="dxa"/>
           <w:left w:w="115" w:type="dxa"/>
-          <w:bottom w:w="0" w:type="dxa"/>
           <w:right w:w="115" w:type="dxa"/>
         </w:tblCellMar>
         <w:tblLook w:val="04A0" w:firstRow="1" w:lastRow="0" w:firstColumn="1" w:lastColumn="0" w:noHBand="0" w:noVBand="1"/>
@@ -592,14 +565,7 @@
                 <w:rFonts w:ascii="Times New Roman" w:eastAsia="Times New Roman" w:hAnsi="Times New Roman" w:cs="Times New Roman"/>
                 <w:szCs w:val="22"/>
               </w:rPr>
-              <w:t>Rakesh Muthyala</w:t>
-            </w:r>
-            <w:r>
-              <w:rPr>
-                <w:rFonts w:ascii="Times New Roman" w:eastAsia="Times New Roman" w:hAnsi="Times New Roman" w:cs="Times New Roman"/>
-                <w:szCs w:val="22"/>
-              </w:rPr>
-              <w:t xml:space="preserve"> </w:t>
+              <w:t xml:space="preserve">Rakesh Muthyala </w:t>
             </w:r>
             <w:r>
               <w:rPr>
@@ -745,14 +711,7 @@
                 <w:rFonts w:ascii="Times New Roman" w:eastAsia="Times New Roman" w:hAnsi="Times New Roman" w:cs="Times New Roman"/>
                 <w:szCs w:val="22"/>
               </w:rPr>
-              <w:t xml:space="preserve"> G</w:t>
-            </w:r>
-            <w:r>
-              <w:rPr>
-                <w:rFonts w:ascii="Times New Roman" w:eastAsia="Times New Roman" w:hAnsi="Times New Roman" w:cs="Times New Roman"/>
-                <w:szCs w:val="22"/>
-              </w:rPr>
-              <w:t xml:space="preserve"> </w:t>
+              <w:t xml:space="preserve"> G </w:t>
             </w:r>
             <w:r>
               <w:rPr>
@@ -845,14 +804,7 @@
                 <w:rFonts w:ascii="Times New Roman" w:eastAsia="Times New Roman" w:hAnsi="Times New Roman" w:cs="Times New Roman"/>
                 <w:szCs w:val="22"/>
               </w:rPr>
-              <w:t>Sumiya Abdul</w:t>
-            </w:r>
-            <w:r>
-              <w:rPr>
-                <w:rFonts w:ascii="Times New Roman" w:eastAsia="Times New Roman" w:hAnsi="Times New Roman" w:cs="Times New Roman"/>
-                <w:szCs w:val="22"/>
-              </w:rPr>
-              <w:t xml:space="preserve"> </w:t>
+              <w:t xml:space="preserve">Sumiya Abdul </w:t>
             </w:r>
             <w:r>
               <w:rPr>
@@ -1463,18 +1415,7 @@
           <w:sz w:val="24"/>
           <w:szCs w:val="28"/>
         </w:rPr>
-        <w:t>Fronten</w:t>
-      </w:r>
-      <w:r>
-        <w:rPr>
-          <w:rFonts w:ascii="Times New Roman" w:eastAsia="Times New Roman" w:hAnsi="Times New Roman" w:cs="Times New Roman"/>
-          <w:b/>
-          <w:bCs/>
-          <w:color w:val="1B1B1B"/>
-          <w:sz w:val="24"/>
-          <w:szCs w:val="28"/>
-        </w:rPr>
-        <w:t>d:</w:t>
+        <w:t>Frontend:</w:t>
       </w:r>
     </w:p>
     <w:p>
@@ -1495,16 +1436,7 @@
           <w:sz w:val="24"/>
           <w:szCs w:val="28"/>
         </w:rPr>
-        <w:t>B</w:t>
-      </w:r>
-      <w:r>
-        <w:rPr>
-          <w:rFonts w:ascii="Times New Roman" w:eastAsia="Times New Roman" w:hAnsi="Times New Roman" w:cs="Times New Roman"/>
-          <w:color w:val="1B1B1B"/>
-          <w:sz w:val="24"/>
-          <w:szCs w:val="28"/>
-        </w:rPr>
-        <w:t>uilt using HTML, CSS, Bootstrap, and JavaScript to provide a responsive and user-friendly interface. The frontend allows users to register, log in, browse available rental properties, search and filter listings based on location, budget, property type, and amenities. Property details, images, and contact information are displayed dynamically, ensuring a smooth and interactive user experience across different devices.</w:t>
+        <w:t>Built using HTML, CSS, Bootstrap, and JavaScript to provide a responsive and user-friendly interface. The frontend allows users to register, log in, browse available rental properties, search and filter listings based on location, budget, property type, and amenities. Property details, images, and contact information are displayed dynamically, ensuring a smooth and interactive user experience across different devices.</w:t>
       </w:r>
     </w:p>
     <w:p>
@@ -1651,16 +1583,7 @@
           <w:color w:val="B45309"/>
           <w:sz w:val="21"/>
         </w:rPr>
-        <w:t>N</w:t>
-      </w:r>
-      <w:r>
-        <w:rPr>
-          <w:rFonts w:ascii="Times New Roman" w:eastAsia="Times New Roman" w:hAnsi="Times New Roman" w:cs="Times New Roman"/>
-          <w:i/>
-          <w:color w:val="B45309"/>
-          <w:sz w:val="21"/>
-        </w:rPr>
-        <w:t>ote: This project uses a trained ML model file rather than a traditional database (e.g., MongoDB). If a database is used for storing user inputs, history, or logs, add its schema and details here.</w:t>
+        <w:t>Note: This project uses a trained ML model file rather than a traditional database (e.g., MongoDB). If a database is used for storing user inputs, history, or logs, add its schema and details here.</w:t>
       </w:r>
       <w:r>
         <w:rPr>
@@ -3143,14 +3066,7 @@
           <w:b w:val="0"/>
           <w:color w:val="45B0E1" w:themeColor="accent1" w:themeTint="99"/>
         </w:rPr>
-        <w:t>5</w:t>
-      </w:r>
-      <w:r>
-        <w:rPr>
-          <w:b w:val="0"/>
-          <w:color w:val="45B0E1" w:themeColor="accent1" w:themeTint="99"/>
-        </w:rPr>
-        <w:t>. Folder Structure</w:t>
+        <w:t>5. Folder Structure</w:t>
       </w:r>
       <w:r>
         <w:rPr>
@@ -3949,14 +3865,7 @@
           <w:rFonts w:ascii="Times New Roman" w:eastAsia="Times New Roman" w:hAnsi="Times New Roman" w:cs="Times New Roman"/>
           <w:sz w:val="21"/>
         </w:rPr>
-        <w:t>B</w:t>
-      </w:r>
-      <w:r>
-        <w:rPr>
-          <w:rFonts w:ascii="Times New Roman" w:eastAsia="Times New Roman" w:hAnsi="Times New Roman" w:cs="Times New Roman"/>
-          <w:sz w:val="21"/>
-        </w:rPr>
-        <w:t>y default, the app will be available at:</w:t>
+        <w:t>By default, the app will be available at:</w:t>
       </w:r>
       <w:r>
         <w:rPr>
@@ -6324,13 +6233,7 @@
         <w:rPr>
           <w:color w:val="45B0E1" w:themeColor="accent1" w:themeTint="99"/>
         </w:rPr>
-        <w:t>8</w:t>
-      </w:r>
-      <w:r>
-        <w:rPr>
-          <w:color w:val="45B0E1" w:themeColor="accent1" w:themeTint="99"/>
-        </w:rPr>
-        <w:t>. Authentication</w:t>
+        <w:t>8. Authentication</w:t>
       </w:r>
       <w:r>
         <w:rPr>
@@ -6469,16 +6372,7 @@
           <w:color w:val="auto"/>
           <w:szCs w:val="28"/>
         </w:rPr>
-        <w:t>T</w:t>
-      </w:r>
-      <w:r>
-        <w:rPr>
-          <w:rFonts w:ascii="Times New Roman" w:eastAsia="Times New Roman" w:hAnsi="Times New Roman" w:cs="Times New Roman"/>
-          <w:iCs/>
-          <w:color w:val="auto"/>
-          <w:szCs w:val="28"/>
-        </w:rPr>
-        <w:t xml:space="preserve">he </w:t>
+        <w:t xml:space="preserve">The </w:t>
       </w:r>
       <w:r>
         <w:rPr>
@@ -7221,15 +7115,7 @@
           <w:b/>
           <w:sz w:val="29"/>
         </w:rPr>
-        <w:t xml:space="preserve"> </w:t>
-      </w:r>
-      <w:r>
-        <w:rPr>
-          <w:rFonts w:ascii="Times New Roman" w:eastAsia="Times New Roman" w:hAnsi="Times New Roman" w:cs="Times New Roman"/>
-          <w:b/>
-          <w:sz w:val="29"/>
-        </w:rPr>
-        <w:t>Link :</w:t>
+        <w:t xml:space="preserve"> Link :</w:t>
       </w:r>
     </w:p>
     <w:p>
@@ -7278,15 +7164,7 @@
           <w:b/>
           <w:sz w:val="29"/>
         </w:rPr>
-        <w:t xml:space="preserve"> </w:t>
-      </w:r>
-      <w:r>
-        <w:rPr>
-          <w:rFonts w:ascii="Times New Roman" w:eastAsia="Times New Roman" w:hAnsi="Times New Roman" w:cs="Times New Roman"/>
-          <w:b/>
-          <w:sz w:val="29"/>
-        </w:rPr>
-        <w:t>Screenshot: example-1:</w:t>
+        <w:t xml:space="preserve"> Screenshot: example-1:</w:t>
       </w:r>
     </w:p>
     <w:p>
@@ -7307,6 +7185,9 @@
         <w:jc w:val="both"/>
       </w:pPr>
       <w:r>
+        <w:rPr>
+          <w:noProof/>
+        </w:rPr>
         <w:lastRenderedPageBreak/>
         <w:drawing>
           <wp:inline distT="0" distB="0" distL="0" distR="0" wp14:anchorId="35857E72" wp14:editId="29F99CB1">
@@ -7348,6 +7229,9 @@
     <w:p/>
     <w:p>
       <w:r>
+        <w:rPr>
+          <w:noProof/>
+        </w:rPr>
         <w:drawing>
           <wp:inline distT="0" distB="0" distL="0" distR="0" wp14:anchorId="56750FFF" wp14:editId="5B099AA5">
             <wp:extent cx="6475730" cy="3045460"/>
@@ -7396,6 +7280,9 @@
         </w:sectPr>
       </w:pPr>
       <w:r>
+        <w:rPr>
+          <w:noProof/>
+        </w:rPr>
         <w:drawing>
           <wp:inline distT="0" distB="0" distL="0" distR="0" wp14:anchorId="6CC5D9DC" wp14:editId="523A2B51">
             <wp:extent cx="6475730" cy="2658110"/>
@@ -7438,6 +7325,9 @@
         <w:ind w:left="-215" w:right="-215"/>
       </w:pPr>
       <w:r>
+        <w:rPr>
+          <w:noProof/>
+        </w:rPr>
         <w:lastRenderedPageBreak/>
         <w:drawing>
           <wp:inline distT="0" distB="0" distL="0" distR="0" wp14:anchorId="3F9C22BE" wp14:editId="5FC63F0A">
@@ -7486,6 +7376,9 @@
         <w:ind w:left="-215" w:right="-215"/>
       </w:pPr>
       <w:r>
+        <w:rPr>
+          <w:noProof/>
+        </w:rPr>
         <w:drawing>
           <wp:inline distT="0" distB="0" distL="0" distR="0" wp14:anchorId="6A2DDC2E" wp14:editId="1ACF0C7F">
             <wp:extent cx="5727700" cy="2637790"/>

</xml_diff>

<commit_message>
Update SAPO Project documentation with latest edits
</commit_message>
<xml_diff>
--- a/SAPO Project.docx
+++ b/SAPO Project.docx
@@ -255,45 +255,115 @@
         <w:spacing w:after="2" w:line="394" w:lineRule="auto"/>
         <w:ind w:left="-5" w:right="4042" w:hanging="10"/>
         <w:rPr>
-          <w:rFonts w:ascii="Times New Roman" w:hAnsi="Times New Roman" w:cs="Times New Roman"/>
-          <w:szCs w:val="22"/>
-        </w:rPr>
-      </w:pPr>
-      <w:r>
-        <w:rPr>
           <w:rFonts w:ascii="Times New Roman" w:eastAsia="Times New Roman" w:hAnsi="Times New Roman" w:cs="Times New Roman"/>
           <w:b/>
           <w:color w:val="1B1B1B"/>
           <w:szCs w:val="22"/>
         </w:rPr>
+      </w:pPr>
+      <w:r>
+        <w:rPr>
+          <w:rFonts w:ascii="Times New Roman" w:eastAsia="Times New Roman" w:hAnsi="Times New Roman" w:cs="Times New Roman"/>
+          <w:b/>
+          <w:color w:val="1B1B1B"/>
+          <w:szCs w:val="22"/>
+        </w:rPr>
         <w:t>Repository</w:t>
       </w:r>
+    </w:p>
+    <w:p>
+      <w:pPr>
+        <w:spacing w:after="2" w:line="394" w:lineRule="auto"/>
+        <w:ind w:left="-5" w:right="4042" w:hanging="10"/>
+        <w:rPr>
+          <w:color w:val="404040" w:themeColor="text1" w:themeTint="BF"/>
+        </w:rPr>
+      </w:pPr>
       <w:r>
         <w:rPr>
           <w:rFonts w:ascii="Times New Roman" w:eastAsia="Times New Roman" w:hAnsi="Times New Roman" w:cs="Times New Roman"/>
-          <w:color w:val="2E74B5"/>
+          <w:b/>
+          <w:color w:val="404040" w:themeColor="text1" w:themeTint="BF"/>
+          <w:szCs w:val="22"/>
+        </w:rPr>
+        <w:t xml:space="preserve">         </w:t>
+      </w:r>
+      <w:r>
+        <w:rPr>
+          <w:rFonts w:ascii="Times New Roman" w:eastAsia="Times New Roman" w:hAnsi="Times New Roman" w:cs="Times New Roman"/>
+          <w:color w:val="404040" w:themeColor="text1" w:themeTint="BF"/>
           <w:szCs w:val="22"/>
         </w:rPr>
         <w:t xml:space="preserve"> </w:t>
-      </w:r>
-      <w:r>
-        <w:rPr>
-          <w:rFonts w:ascii="Times New Roman" w:eastAsia="Times New Roman" w:hAnsi="Times New Roman" w:cs="Times New Roman"/>
-          <w:color w:val="2E74B5"/>
-          <w:szCs w:val="22"/>
-        </w:rPr>
-        <w:t> </w:t>
       </w:r>
       <w:hyperlink r:id="rId8" w:history="1">
         <w:r>
           <w:rPr>
             <w:rStyle w:val="Hyperlink"/>
             <w:rFonts w:ascii="Times New Roman" w:eastAsia="Times New Roman" w:hAnsi="Times New Roman" w:cs="Times New Roman"/>
+            <w:b/>
+            <w:color w:val="404040" w:themeColor="text1" w:themeTint="BF"/>
             <w:szCs w:val="22"/>
           </w:rPr>
-          <w:t>https://github.com/rakesh429/househunt-mern-stack</w:t>
+          <w:t>https://github.com/Sowmya_2602</w:t>
         </w:r>
       </w:hyperlink>
+    </w:p>
+    <w:p>
+      <w:pPr>
+        <w:spacing w:after="2" w:line="394" w:lineRule="auto"/>
+        <w:ind w:left="-5" w:right="4042" w:hanging="10"/>
+        <w:rPr>
+          <w:color w:val="404040" w:themeColor="text1" w:themeTint="BF"/>
+        </w:rPr>
+      </w:pPr>
+      <w:r>
+        <w:rPr>
+          <w:color w:val="404040" w:themeColor="text1" w:themeTint="BF"/>
+        </w:rPr>
+        <w:t xml:space="preserve">           </w:t>
+      </w:r>
+      <w:hyperlink r:id="rId9" w:history="1">
+        <w:r>
+          <w:rPr>
+            <w:rStyle w:val="Hyperlink"/>
+            <w:color w:val="404040" w:themeColor="text1" w:themeTint="BF"/>
+          </w:rPr>
+          <w:t>https://github.com/rakesh429</w:t>
+        </w:r>
+      </w:hyperlink>
+    </w:p>
+    <w:p>
+      <w:pPr>
+        <w:spacing w:after="2" w:line="394" w:lineRule="auto"/>
+        <w:ind w:left="-5" w:right="4042" w:hanging="10"/>
+      </w:pPr>
+      <w:r>
+        <w:rPr>
+          <w:rFonts w:ascii="Times New Roman" w:eastAsia="Times New Roman" w:hAnsi="Times New Roman" w:cs="Times New Roman"/>
+          <w:b/>
+          <w:color w:val="747474" w:themeColor="background2" w:themeShade="80"/>
+          <w:szCs w:val="22"/>
+        </w:rPr>
+        <w:t xml:space="preserve"> </w:t>
+      </w:r>
+      <w:r>
+        <w:rPr>
+          <w:rFonts w:ascii="Times New Roman" w:eastAsia="Times New Roman" w:hAnsi="Times New Roman" w:cs="Times New Roman"/>
+          <w:b/>
+          <w:color w:val="747474" w:themeColor="background2" w:themeShade="80"/>
+          <w:szCs w:val="22"/>
+        </w:rPr>
+        <w:t xml:space="preserve"> </w:t>
+      </w:r>
+      <w:r>
+        <w:rPr>
+          <w:rFonts w:ascii="Times New Roman" w:eastAsia="Times New Roman" w:hAnsi="Times New Roman" w:cs="Times New Roman"/>
+          <w:color w:val="747474" w:themeColor="background2" w:themeShade="80"/>
+          <w:szCs w:val="22"/>
+        </w:rPr>
+        <w:t xml:space="preserve"> </w:t>
+      </w:r>
     </w:p>
     <w:p>
       <w:pPr>
@@ -1202,6 +1272,7 @@
         <w:rPr>
           <w:rFonts w:ascii="Times New Roman" w:hAnsi="Times New Roman" w:cs="Times New Roman"/>
         </w:rPr>
+        <w:lastRenderedPageBreak/>
         <w:t xml:space="preserve">Responsive and user-friendly web interface accessible across desktops, tablets, and mobile devices. </w:t>
       </w:r>
     </w:p>
@@ -1271,7 +1342,6 @@
         <w:rPr>
           <w:color w:val="45B0E1" w:themeColor="accent1" w:themeTint="99"/>
         </w:rPr>
-        <w:lastRenderedPageBreak/>
         <w:t>3. Architecture</w:t>
       </w:r>
       <w:r>
@@ -1845,6 +1915,7 @@
           <w:rFonts w:ascii="Times New Roman" w:hAnsi="Times New Roman" w:cs="Times New Roman"/>
           <w:sz w:val="24"/>
         </w:rPr>
+        <w:lastRenderedPageBreak/>
         <w:t xml:space="preserve">• Visual Studio Code (or any IDE) </w:t>
       </w:r>
     </w:p>
@@ -1896,7 +1967,6 @@
           <w:rFonts w:ascii="Times New Roman" w:hAnsi="Times New Roman" w:cs="Times New Roman"/>
           <w:sz w:val="24"/>
         </w:rPr>
-        <w:lastRenderedPageBreak/>
         <w:t>Frontend (Client)</w:t>
       </w:r>
     </w:p>
@@ -2181,7 +2251,7 @@
         </w:rPr>
         <w:t xml:space="preserve">git clone </w:t>
       </w:r>
-      <w:hyperlink r:id="rId9" w:history="1">
+      <w:hyperlink r:id="rId10" w:history="1">
         <w:r>
           <w:rPr>
             <w:rStyle w:val="Hyperlink"/>
@@ -2554,6 +2624,7 @@
           <w:color w:val="auto"/>
           <w:sz w:val="24"/>
         </w:rPr>
+        <w:lastRenderedPageBreak/>
         <w:t>4</w:t>
       </w:r>
       <w:r>
@@ -2723,7 +2794,6 @@
           <w:color w:val="auto"/>
           <w:sz w:val="24"/>
         </w:rPr>
-        <w:lastRenderedPageBreak/>
         <w:t>5. Start the Backend Server</w:t>
       </w:r>
     </w:p>
@@ -2994,7 +3064,7 @@
           <w:sz w:val="24"/>
         </w:rPr>
       </w:pPr>
-      <w:hyperlink r:id="rId10" w:history="1">
+      <w:hyperlink r:id="rId11" w:history="1">
         <w:r>
           <w:rPr>
             <w:rStyle w:val="Hyperlink"/>
@@ -3039,7 +3109,7 @@
           <w:sz w:val="24"/>
         </w:rPr>
       </w:pPr>
-      <w:hyperlink r:id="rId11" w:history="1">
+      <w:hyperlink r:id="rId12" w:history="1">
         <w:r>
           <w:rPr>
             <w:rStyle w:val="Hyperlink"/>
@@ -3818,6 +3888,7 @@
           <w:bCs/>
           <w:szCs w:val="32"/>
         </w:rPr>
+        <w:lastRenderedPageBreak/>
         <w:t>Start the Backend Server</w:t>
       </w:r>
     </w:p>
@@ -3884,7 +3955,7 @@
           <w:rFonts w:ascii="Times New Roman" w:hAnsi="Times New Roman" w:cs="Times New Roman"/>
         </w:rPr>
       </w:pPr>
-      <w:hyperlink r:id="rId12" w:history="1">
+      <w:hyperlink r:id="rId13" w:history="1">
         <w:r>
           <w:rPr>
             <w:rStyle w:val="Hyperlink"/>
@@ -3921,7 +3992,6 @@
     <w:p>
       <w:proofErr w:type="spellStart"/>
       <w:r>
-        <w:lastRenderedPageBreak/>
         <w:t>npm</w:t>
       </w:r>
       <w:proofErr w:type="spellEnd"/>
@@ -3958,7 +4028,7 @@
       <w:pPr>
         <w:ind w:left="0"/>
       </w:pPr>
-      <w:hyperlink r:id="rId13" w:history="1">
+      <w:hyperlink r:id="rId14" w:history="1">
         <w:r>
           <w:rPr>
             <w:rStyle w:val="Hyperlink"/>
@@ -4796,6 +4866,7 @@
           <w:sz w:val="22"/>
           <w:szCs w:val="22"/>
         </w:rPr>
+        <w:lastRenderedPageBreak/>
         <w:t>G</w:t>
       </w:r>
       <w:r>
@@ -5145,7 +5216,6 @@
           <w:sz w:val="22"/>
           <w:szCs w:val="22"/>
         </w:rPr>
-        <w:lastRenderedPageBreak/>
         <w:t>POST /</w:t>
       </w:r>
       <w:proofErr w:type="spellStart"/>
@@ -6199,6 +6269,7 @@
           <w:color w:val="45B0E1" w:themeColor="accent1" w:themeTint="99"/>
           <w:sz w:val="23"/>
         </w:rPr>
+        <w:lastRenderedPageBreak/>
         <w:t>Top of Form</w:t>
       </w:r>
     </w:p>
@@ -6509,7 +6580,6 @@
           <w:color w:val="auto"/>
           <w:szCs w:val="28"/>
         </w:rPr>
-        <w:lastRenderedPageBreak/>
         <w:t xml:space="preserve">Role-based Access (Admin, Owner, Tenant) </w:t>
       </w:r>
     </w:p>
@@ -7083,6 +7153,7 @@
         </w:numPr>
       </w:pPr>
       <w:r>
+        <w:lastRenderedPageBreak/>
         <w:t>Performance and usability testing to ensure fast loading and smooth navigation.</w:t>
       </w:r>
     </w:p>
@@ -7127,7 +7198,7 @@
           <w:sz w:val="29"/>
         </w:rPr>
       </w:pPr>
-      <w:hyperlink r:id="rId14" w:history="1">
+      <w:hyperlink r:id="rId15" w:history="1">
         <w:r>
           <w:rPr>
             <w:rStyle w:val="Hyperlink"/>
@@ -7188,7 +7259,6 @@
         <w:rPr>
           <w:noProof/>
         </w:rPr>
-        <w:lastRenderedPageBreak/>
         <w:drawing>
           <wp:inline distT="0" distB="0" distL="0" distR="0" wp14:anchorId="35857E72" wp14:editId="29F99CB1">
             <wp:extent cx="6475730" cy="2742565"/>
@@ -7205,7 +7275,7 @@
                     <pic:cNvPicPr/>
                   </pic:nvPicPr>
                   <pic:blipFill>
-                    <a:blip r:embed="rId15"/>
+                    <a:blip r:embed="rId16"/>
                     <a:stretch>
                       <a:fillRect/>
                     </a:stretch>
@@ -7248,7 +7318,7 @@
                     <pic:cNvPicPr/>
                   </pic:nvPicPr>
                   <pic:blipFill>
-                    <a:blip r:embed="rId16"/>
+                    <a:blip r:embed="rId17"/>
                     <a:stretch>
                       <a:fillRect/>
                     </a:stretch>
@@ -7273,12 +7343,60 @@
     <w:p/>
     <w:p>
       <w:pPr>
+        <w:rPr>
+          <w:noProof/>
+        </w:rPr>
+      </w:pPr>
+    </w:p>
+    <w:p>
+      <w:pPr>
         <w:sectPr>
           <w:pgSz w:w="11900" w:h="16820"/>
           <w:pgMar w:top="851" w:right="851" w:bottom="851" w:left="851" w:header="720" w:footer="720" w:gutter="0"/>
           <w:cols w:space="720"/>
         </w:sectPr>
       </w:pPr>
+      <w:r>
+        <w:rPr>
+          <w:noProof/>
+        </w:rPr>
+        <w:lastRenderedPageBreak/>
+        <w:drawing>
+          <wp:inline distT="0" distB="0" distL="0" distR="0" wp14:anchorId="1713BDD4" wp14:editId="6B662769">
+            <wp:extent cx="5727700" cy="2716530"/>
+            <wp:effectExtent l="0" t="0" r="6350" b="7620"/>
+            <wp:docPr id="163978549" name="Picture 1"/>
+            <wp:cNvGraphicFramePr>
+              <a:graphicFrameLocks xmlns:a="http://schemas.openxmlformats.org/drawingml/2006/main" noChangeAspect="1"/>
+            </wp:cNvGraphicFramePr>
+            <a:graphic xmlns:a="http://schemas.openxmlformats.org/drawingml/2006/main">
+              <a:graphicData uri="http://schemas.openxmlformats.org/drawingml/2006/picture">
+                <pic:pic xmlns:pic="http://schemas.openxmlformats.org/drawingml/2006/picture">
+                  <pic:nvPicPr>
+                    <pic:cNvPr id="1116593464" name=""/>
+                    <pic:cNvPicPr/>
+                  </pic:nvPicPr>
+                  <pic:blipFill>
+                    <a:blip r:embed="rId18"/>
+                    <a:stretch>
+                      <a:fillRect/>
+                    </a:stretch>
+                  </pic:blipFill>
+                  <pic:spPr>
+                    <a:xfrm>
+                      <a:off x="0" y="0"/>
+                      <a:ext cx="5727700" cy="2716530"/>
+                    </a:xfrm>
+                    <a:prstGeom prst="rect">
+                      <a:avLst/>
+                    </a:prstGeom>
+                  </pic:spPr>
+                </pic:pic>
+              </a:graphicData>
+            </a:graphic>
+          </wp:inline>
+        </w:drawing>
+      </w:r>
       <w:r>
         <w:rPr>
           <w:noProof/>
@@ -7299,7 +7417,7 @@
                     <pic:cNvPicPr/>
                   </pic:nvPicPr>
                   <pic:blipFill>
-                    <a:blip r:embed="rId17"/>
+                    <a:blip r:embed="rId19"/>
                     <a:stretch>
                       <a:fillRect/>
                     </a:stretch>
@@ -7395,7 +7513,7 @@
                     <pic:cNvPicPr/>
                   </pic:nvPicPr>
                   <pic:blipFill>
-                    <a:blip r:embed="rId19"/>
+                    <a:blip r:embed="rId20"/>
                     <a:stretch>
                       <a:fillRect/>
                     </a:stretch>
@@ -11496,6 +11614,7 @@
   <w:style w:type="character" w:default="1" w:styleId="DefaultParagraphFont">
     <w:name w:val="Default Paragraph Font"/>
     <w:uiPriority w:val="1"/>
+    <w:semiHidden/>
     <w:unhideWhenUsed/>
   </w:style>
   <w:style w:type="table" w:default="1" w:styleId="TableNormal">

</xml_diff>